<commit_message>
them file flows node red cho trang trai thong minh
</commit_message>
<xml_diff>
--- a/Thietkevatrienkhaihethongtrangtraithongminh.docx
+++ b/Thietkevatrienkhaihethongtrangtraithongminh.docx
@@ -289,7 +289,7 @@
           </mc:Choice>
           <mc:Fallback>
             <w:pict>
-              <v:group id="_x0000_s1026" o:spid="_x0000_s1026" o:spt="203" style="position:absolute;left:0pt;margin-left:34.15pt;margin-top:-59.7pt;height:780pt;width:534.8pt;mso-position-horizontal-relative:page;z-index:-251657216;mso-width-relative:page;mso-height-relative:page;" coordorigin="1371,1148" coordsize="9761,14595" o:gfxdata="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">
+              <v:group id="_x0000_s1026" o:spid="_x0000_s1026" o:spt="203" style="position:absolute;left:0pt;margin-left:34.15pt;margin-top:-59.7pt;height:780pt;width:534.8pt;mso-position-horizontal-relative:page;z-index:-251657216;mso-width-relative:page;mso-height-relative:page;" coordorigin="1371,1148" coordsize="9761,14595" o:gfxdata="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">
                 <o:lock v:ext="edit" aspectratio="f"/>
                 <v:shape id="Picture 7" o:spid="_x0000_s1026" o:spt="75" alt="116120" type="#_x0000_t75" style="position:absolute;left:9124;top:1199;height:1911;width:2008;" filled="f" o:preferrelative="t" stroked="f" coordsize="21600,21600" o:gfxdata="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">
                   <v:fill on="f" focussize="0,0"/>
@@ -8755,8 +8755,6 @@
         </w:rPr>
         <w:t>Kết luận</w:t>
       </w:r>
-      <w:bookmarkStart w:id="1" w:name="_GoBack"/>
-      <w:bookmarkEnd w:id="1"/>
     </w:p>
     <w:p>
       <w:pPr>
@@ -9553,6 +9551,172 @@
           <w:szCs w:val="32"/>
           <w:lang w:val="en-US"/>
         </w:rPr>
+      </w:pPr>
+      <w:r>
+        <w:rPr>
+          <w:rFonts w:hint="default" w:ascii="Times New Roman" w:hAnsi="Times New Roman" w:eastAsia="SimSun" w:cs="Times New Roman"/>
+          <w:sz w:val="32"/>
+          <w:szCs w:val="32"/>
+        </w:rPr>
+        <w:t xml:space="preserve">[4] Wokwi Simulator, </w:t>
+      </w:r>
+      <w:r>
+        <w:rPr>
+          <w:rFonts w:hint="default" w:ascii="Times New Roman" w:hAnsi="Times New Roman" w:eastAsia="SimSun" w:cs="Times New Roman"/>
+          <w:i/>
+          <w:iCs/>
+          <w:sz w:val="32"/>
+          <w:szCs w:val="32"/>
+        </w:rPr>
+        <w:t>Nền tảng mô phỏng mạch điện tử và IoT trực tuyến</w:t>
+      </w:r>
+      <w:r>
+        <w:rPr>
+          <w:rFonts w:hint="default" w:ascii="Times New Roman" w:hAnsi="Times New Roman" w:eastAsia="SimSun" w:cs="Times New Roman"/>
+          <w:sz w:val="32"/>
+          <w:szCs w:val="32"/>
+        </w:rPr>
+        <w:t xml:space="preserve">, có sẵn tại: </w:t>
+      </w:r>
+      <w:r>
+        <w:rPr>
+          <w:rFonts w:hint="default" w:ascii="Times New Roman" w:hAnsi="Times New Roman" w:eastAsia="SimSun" w:cs="Times New Roman"/>
+          <w:sz w:val="32"/>
+          <w:szCs w:val="32"/>
+        </w:rPr>
+        <w:fldChar w:fldCharType="begin"/>
+      </w:r>
+      <w:r>
+        <w:rPr>
+          <w:rFonts w:hint="default" w:ascii="Times New Roman" w:hAnsi="Times New Roman" w:eastAsia="SimSun" w:cs="Times New Roman"/>
+          <w:sz w:val="32"/>
+          <w:szCs w:val="32"/>
+        </w:rPr>
+        <w:instrText xml:space="preserve"> HYPERLINK "https://wokwi.com/" \t "_blank" </w:instrText>
+      </w:r>
+      <w:r>
+        <w:rPr>
+          <w:rFonts w:hint="default" w:ascii="Times New Roman" w:hAnsi="Times New Roman" w:eastAsia="SimSun" w:cs="Times New Roman"/>
+          <w:sz w:val="32"/>
+          <w:szCs w:val="32"/>
+        </w:rPr>
+        <w:fldChar w:fldCharType="separate"/>
+      </w:r>
+      <w:r>
+        <w:rPr>
+          <w:rStyle w:val="10"/>
+          <w:rFonts w:hint="default" w:ascii="Times New Roman" w:hAnsi="Times New Roman" w:eastAsia="SimSun" w:cs="Times New Roman"/>
+          <w:sz w:val="32"/>
+          <w:szCs w:val="32"/>
+        </w:rPr>
+        <w:t>https://wokwi.com/</w:t>
+      </w:r>
+      <w:r>
+        <w:rPr>
+          <w:rFonts w:hint="default" w:ascii="Times New Roman" w:hAnsi="Times New Roman" w:eastAsia="SimSun" w:cs="Times New Roman"/>
+          <w:sz w:val="32"/>
+          <w:szCs w:val="32"/>
+        </w:rPr>
+        <w:fldChar w:fldCharType="end"/>
+      </w:r>
+    </w:p>
+    <w:p>
+      <w:pPr>
+        <w:pStyle w:val="11"/>
+        <w:keepNext w:val="0"/>
+        <w:keepLines w:val="0"/>
+        <w:widowControl/>
+        <w:numPr>
+          <w:numId w:val="0"/>
+        </w:numPr>
+        <w:suppressLineNumbers w:val="0"/>
+        <w:spacing w:before="0" w:beforeAutospacing="1" w:after="0" w:afterAutospacing="1"/>
+        <w:ind w:right="0" w:rightChars="0"/>
+        <w:jc w:val="left"/>
+        <w:rPr>
+          <w:rFonts w:hint="default" w:ascii="Times New Roman" w:hAnsi="Times New Roman" w:eastAsia="SimSun" w:cs="Times New Roman"/>
+          <w:sz w:val="32"/>
+          <w:szCs w:val="32"/>
+        </w:rPr>
+      </w:pPr>
+    </w:p>
+    <w:p>
+      <w:pPr>
+        <w:pStyle w:val="11"/>
+        <w:keepNext w:val="0"/>
+        <w:keepLines w:val="0"/>
+        <w:widowControl/>
+        <w:numPr>
+          <w:numId w:val="0"/>
+        </w:numPr>
+        <w:suppressLineNumbers w:val="0"/>
+        <w:spacing w:before="0" w:beforeAutospacing="1" w:after="0" w:afterAutospacing="1"/>
+        <w:ind w:right="0" w:rightChars="0"/>
+        <w:jc w:val="left"/>
+        <w:rPr>
+          <w:rFonts w:hint="default" w:ascii="Times New Roman" w:hAnsi="Times New Roman" w:eastAsia="SimSun" w:cs="Times New Roman"/>
+          <w:sz w:val="32"/>
+          <w:szCs w:val="32"/>
+        </w:rPr>
+      </w:pPr>
+    </w:p>
+    <w:p>
+      <w:pPr>
+        <w:pStyle w:val="11"/>
+        <w:keepNext w:val="0"/>
+        <w:keepLines w:val="0"/>
+        <w:widowControl/>
+        <w:numPr>
+          <w:numId w:val="0"/>
+        </w:numPr>
+        <w:suppressLineNumbers w:val="0"/>
+        <w:spacing w:before="0" w:beforeAutospacing="1" w:after="0" w:afterAutospacing="1"/>
+        <w:ind w:right="0" w:rightChars="0"/>
+        <w:jc w:val="left"/>
+        <w:rPr>
+          <w:rFonts w:hint="default" w:cs="Times New Roman"/>
+          <w:b/>
+          <w:bCs/>
+          <w:sz w:val="40"/>
+          <w:szCs w:val="40"/>
+          <w:lang w:val="en-US"/>
+        </w:rPr>
+      </w:pPr>
+      <w:r>
+        <w:rPr>
+          <w:rFonts w:hint="default" w:cs="Times New Roman"/>
+          <w:b/>
+          <w:bCs/>
+          <w:sz w:val="40"/>
+          <w:szCs w:val="40"/>
+          <w:lang w:val="en-US"/>
+        </w:rPr>
+        <w:t>PHỤ LỤC</w:t>
+      </w:r>
+      <w:bookmarkStart w:id="1" w:name="_GoBack"/>
+      <w:bookmarkEnd w:id="1"/>
+    </w:p>
+    <w:p>
+      <w:pPr>
+        <w:pStyle w:val="11"/>
+        <w:keepNext w:val="0"/>
+        <w:keepLines w:val="0"/>
+        <w:widowControl/>
+        <w:numPr>
+          <w:numId w:val="0"/>
+        </w:numPr>
+        <w:suppressLineNumbers w:val="0"/>
+        <w:spacing w:before="0" w:beforeAutospacing="1" w:after="0" w:afterAutospacing="1"/>
+        <w:ind w:right="0" w:rightChars="0"/>
+        <w:jc w:val="left"/>
+        <w:rPr>
+          <w:rFonts w:hint="default" w:cs="Times New Roman"/>
+          <w:b/>
+          <w:bCs/>
+          <w:sz w:val="40"/>
+          <w:szCs w:val="40"/>
+          <w:lang w:val="en-US"/>
+        </w:rPr>
         <w:sectPr>
           <w:pgSz w:w="11906" w:h="16838"/>
           <w:pgMar w:top="1440" w:right="1800" w:bottom="1440" w:left="1800" w:header="720" w:footer="720" w:gutter="0"/>
@@ -9562,70 +9726,14 @@
       </w:pPr>
       <w:r>
         <w:rPr>
-          <w:rFonts w:hint="default" w:ascii="Times New Roman" w:hAnsi="Times New Roman" w:eastAsia="SimSun" w:cs="Times New Roman"/>
-          <w:sz w:val="32"/>
-          <w:szCs w:val="32"/>
-        </w:rPr>
-        <w:t xml:space="preserve">[4] Wokwi Simulator, </w:t>
-      </w:r>
-      <w:r>
-        <w:rPr>
-          <w:rFonts w:hint="default" w:ascii="Times New Roman" w:hAnsi="Times New Roman" w:eastAsia="SimSun" w:cs="Times New Roman"/>
-          <w:i/>
-          <w:iCs/>
-          <w:sz w:val="32"/>
-          <w:szCs w:val="32"/>
-        </w:rPr>
-        <w:t>Nền tảng mô phỏng mạch điện tử và IoT trực tuyến</w:t>
-      </w:r>
-      <w:r>
-        <w:rPr>
-          <w:rFonts w:hint="default" w:ascii="Times New Roman" w:hAnsi="Times New Roman" w:eastAsia="SimSun" w:cs="Times New Roman"/>
-          <w:sz w:val="32"/>
-          <w:szCs w:val="32"/>
-        </w:rPr>
-        <w:t xml:space="preserve">, có sẵn tại: </w:t>
-      </w:r>
-      <w:r>
-        <w:rPr>
-          <w:rFonts w:hint="default" w:ascii="Times New Roman" w:hAnsi="Times New Roman" w:eastAsia="SimSun" w:cs="Times New Roman"/>
-          <w:sz w:val="32"/>
-          <w:szCs w:val="32"/>
-        </w:rPr>
-        <w:fldChar w:fldCharType="begin"/>
-      </w:r>
-      <w:r>
-        <w:rPr>
-          <w:rFonts w:hint="default" w:ascii="Times New Roman" w:hAnsi="Times New Roman" w:eastAsia="SimSun" w:cs="Times New Roman"/>
-          <w:sz w:val="32"/>
-          <w:szCs w:val="32"/>
-        </w:rPr>
-        <w:instrText xml:space="preserve"> HYPERLINK "https://wokwi.com/" \t "_blank" </w:instrText>
-      </w:r>
-      <w:r>
-        <w:rPr>
-          <w:rFonts w:hint="default" w:ascii="Times New Roman" w:hAnsi="Times New Roman" w:eastAsia="SimSun" w:cs="Times New Roman"/>
-          <w:sz w:val="32"/>
-          <w:szCs w:val="32"/>
-        </w:rPr>
-        <w:fldChar w:fldCharType="separate"/>
-      </w:r>
-      <w:r>
-        <w:rPr>
-          <w:rStyle w:val="10"/>
-          <w:rFonts w:hint="default" w:ascii="Times New Roman" w:hAnsi="Times New Roman" w:eastAsia="SimSun" w:cs="Times New Roman"/>
-          <w:sz w:val="32"/>
-          <w:szCs w:val="32"/>
-        </w:rPr>
-        <w:t>https://wokwi.com/</w:t>
-      </w:r>
-      <w:r>
-        <w:rPr>
-          <w:rFonts w:hint="default" w:ascii="Times New Roman" w:hAnsi="Times New Roman" w:eastAsia="SimSun" w:cs="Times New Roman"/>
-          <w:sz w:val="32"/>
-          <w:szCs w:val="32"/>
-        </w:rPr>
-        <w:fldChar w:fldCharType="end"/>
+          <w:rFonts w:hint="default" w:cs="Times New Roman"/>
+          <w:b/>
+          <w:bCs/>
+          <w:sz w:val="40"/>
+          <w:szCs w:val="40"/>
+          <w:lang w:val="en-US"/>
+        </w:rPr>
+        <w:t>https://github.com/vovancuong1608/he-thong-trang-trai-thong-minh</w:t>
       </w:r>
     </w:p>
     <w:p>

</xml_diff>